<commit_message>
Refresh Zippee PM resume onto current base for interview (EXT18, 94%; 0-1/technical/SQL)
Co-Authored-By: Claude Opus 4.8 <noreply@anthropic.com>
</commit_message>
<xml_diff>
--- a/resumes/Zippee-Product Manager.docx
+++ b/resumes/Zippee-Product Manager.docx
@@ -13,7 +13,7 @@
           <w:b/>
           <w:i w:val="0"/>
           <w:color w:val="1F3864"/>
-          <w:sz w:val="35"/>
+          <w:sz w:val="34"/>
         </w:rPr>
         <w:t>KSHITIZ YADAV</w:t>
       </w:r>
@@ -29,10 +29,56 @@
           <w:b w:val="0"/>
           <w:i w:val="0"/>
           <w:color w:val="444444"/>
-          <w:sz w:val="20"/>
+          <w:sz w:val="19"/>
         </w:rPr>
-        <w:t>Product Manager  |  0-1 Product Building  |  Technical Solutioning &amp; System Integration  |  Cross-Functional Execution  |  Gurugram</w:t>
+        <w:t>Product Manager  |  0-to-1 Product Building  |  Technical Solutioning &amp; System Integration  |  SQL &amp; Cross-Functional Execution  |  Gurugram</w:t>
       </w:r>
+    </w:p>
+    <w:p>
+      <w:pPr>
+        <w:spacing w:after="20"/>
+        <w:jc w:val="center"/>
+      </w:pPr>
+      <w:r>
+        <w:rPr>
+          <w:rFonts w:ascii="Calibri" w:hAnsi="Calibri"/>
+          <w:b w:val="0"/>
+          <w:i w:val="0"/>
+          <w:color w:val="444444"/>
+          <w:sz w:val="18"/>
+        </w:rPr>
+        <w:t xml:space="preserve">Gurugram, India  •  +91 8756972501  •  </w:t>
+      </w:r>
+      <w:hyperlink r:id="rId9">
+        <w:r>
+          <w:rPr>
+            <w:rFonts w:ascii="Calibri" w:hAnsi="Calibri"/>
+            <w:color w:val="444444"/>
+            <w:sz w:val="18"/>
+          </w:rPr>
+          <w:t xml:space="preserve">kshitizyadav788@gmail.com</w:t>
+        </w:r>
+      </w:hyperlink>
+      <w:r>
+        <w:rPr>
+          <w:rFonts w:ascii="Calibri" w:hAnsi="Calibri"/>
+          <w:b w:val="0"/>
+          <w:i w:val="0"/>
+          <w:color w:val="444444"/>
+          <w:sz w:val="18"/>
+        </w:rPr>
+        <w:t xml:space="preserve">  •  </w:t>
+      </w:r>
+      <w:hyperlink r:id="rId10">
+        <w:r>
+          <w:rPr>
+            <w:rFonts w:ascii="Calibri" w:hAnsi="Calibri"/>
+            <w:color w:val="444444"/>
+            <w:sz w:val="18"/>
+          </w:rPr>
+          <w:t xml:space="preserve">linkedin.com/in/kshitizyadav</w:t>
+        </w:r>
+      </w:hyperlink>
     </w:p>
     <w:p>
       <w:pPr>
@@ -42,17 +88,17 @@
       <w:r>
         <w:rPr>
           <w:rFonts w:ascii="Calibri" w:hAnsi="Calibri"/>
-          <w:b w:val="0"/>
+          <w:b/>
           <w:i w:val="0"/>
-          <w:color w:val="444444"/>
-          <w:sz w:val="19"/>
+          <w:color w:val="2E5AAC"/>
+          <w:sz w:val="18"/>
         </w:rPr>
-        <w:t>Gurugram, India  •  +91 8756972501  •  kshitizyadav788@gmail.com  •  linkedin.com/in/kshitizyadav</w:t>
+        <w:t>20% Revenue Growth   •   25% ARPU Expansion (₹35K → ₹45K)   •   ₹70L Renewals in a Single Month   •   80% Lower Ops Workload</w:t>
       </w:r>
     </w:p>
     <w:p>
       <w:pPr>
-        <w:spacing w:before="150" w:after="70"/>
+        <w:spacing w:before="150" w:after="60"/>
         <w:pBdr>
           <w:bottom w:val="single" w:sz="6" w:space="1" w:color="2E5AAC"/>
         </w:pBdr>
@@ -62,7 +108,7 @@
           <w:rFonts w:ascii="Calibri" w:hAnsi="Calibri"/>
           <w:b/>
           <w:color w:val="1F3864"/>
-          <w:sz w:val="23"/>
+          <w:sz w:val="22"/>
         </w:rPr>
         <w:t>PROFESSIONAL SUMMARY</w:t>
       </w:r>
@@ -76,14 +122,14 @@
           <w:rFonts w:ascii="Calibri" w:hAnsi="Calibri"/>
           <w:b w:val="0"/>
           <w:i w:val="0"/>
-          <w:sz w:val="20"/>
+          <w:sz w:val="19"/>
         </w:rPr>
-        <w:t>Product Manager with 5+ years owning high-impact, cross-functional projects end-to-end — from scoping to execution — at a high-growth startup, based in Gurugram. Comfortable going deep with engineering on technical solutioning: translating business requirements into scalable functional flows and stitching together systems and third-party integrations. Led 0-1 product builds (consumer app MVP in 2 months) and complex integrations (6 payment gateways, in-house platforms) with Engineering, Operations, and external partners. Sharp problem-solver with high ownership in fast, unstructured environments — record of 20% revenue growth, 25% ARPU expansion, ₹70L in renewals, and ₹1.6L/month in automation savings.</w:t>
+        <w:t>Product Manager with 5+ years owning high-impact, cross-functional projects end-to-end, from scoping to execution, at a high-growth consumer platform serving 150,000+ users and 30,000+ daily actives. Goes deep with engineering on technical solutioning: translating business requirements into scalable functional flows and stitching together systems and third-party integrations. Led 0-to-1 product builds (consumer app MVP in 2 months, in-house platforms) and complex integrations (6 payment gateways, omnichannel systems), and writes SQL queries for data analysis and product decisions. Thrives in fast, unstructured environments with high ownership.</w:t>
       </w:r>
     </w:p>
     <w:p>
       <w:pPr>
-        <w:spacing w:before="150" w:after="70"/>
+        <w:spacing w:before="150" w:after="60"/>
         <w:pBdr>
           <w:bottom w:val="single" w:sz="6" w:space="1" w:color="2E5AAC"/>
         </w:pBdr>
@@ -93,202 +139,7 @@
           <w:rFonts w:ascii="Calibri" w:hAnsi="Calibri"/>
           <w:b/>
           <w:color w:val="1F3864"/>
-          <w:sz w:val="23"/>
-        </w:rPr>
-        <w:t>PROFESSIONAL EXPERIENCE</w:t>
-      </w:r>
-    </w:p>
-    <w:p>
-      <w:pPr>
-        <w:tabs>
-          <w:tab w:pos="10546" w:val="right"/>
-        </w:tabs>
-        <w:spacing w:after="0"/>
-      </w:pPr>
-      <w:r>
-        <w:rPr>
-          <w:rFonts w:ascii="Calibri" w:hAnsi="Calibri"/>
-          <w:b/>
-          <w:i w:val="0"/>
           <w:sz w:val="22"/>
-        </w:rPr>
-        <w:t>PlanetSpark — Product Manager</w:t>
-      </w:r>
-      <w:r>
-        <w:rPr>
-          <w:rFonts w:ascii="Calibri" w:hAnsi="Calibri"/>
-          <w:b w:val="0"/>
-          <w:i w:val="0"/>
-          <w:color w:val="444444"/>
-          <w:sz w:val="20"/>
-        </w:rPr>
-        <w:tab/>
-        <w:t>Gurugram · Mar 2021 – Present</w:t>
-      </w:r>
-    </w:p>
-    <w:p>
-      <w:pPr>
-        <w:spacing w:after="70"/>
-      </w:pPr>
-      <w:r>
-        <w:rPr>
-          <w:rFonts w:ascii="Calibri" w:hAnsi="Calibri"/>
-          <w:b w:val="0"/>
-          <w:i/>
-          <w:color w:val="333333"/>
-          <w:sz w:val="20"/>
-        </w:rPr>
-        <w:t>Own the full product suite of a B2C EdTech marketplace -- one of India's largest public speaking &amp; creative writing platforms, connecting students and teachers via a shared LMS: consumer app, student &amp; teacher LMS, sales CRM, product-led growth &amp; renewal engine, and an in-house AI layer.</w:t>
-      </w:r>
-    </w:p>
-    <w:p>
-      <w:pPr>
-        <w:spacing w:before="90" w:after="0"/>
-      </w:pPr>
-      <w:r>
-        <w:rPr>
-          <w:rFonts w:ascii="Calibri" w:hAnsi="Calibri"/>
-          <w:b/>
-          <w:i/>
-          <w:color w:val="2E5AAC"/>
-          <w:sz w:val="20"/>
-        </w:rPr>
-        <w:t>0-1 Building &amp; Technical Solutioning</w:t>
-      </w:r>
-    </w:p>
-    <w:p>
-      <w:pPr>
-        <w:pStyle w:val="ListBullet"/>
-        <w:spacing w:after="70" w:before="0" w:line="283" w:lineRule="auto"/>
-      </w:pPr>
-      <w:r>
-        <w:rPr>
-          <w:rFonts w:ascii="Calibri" w:hAnsi="Calibri"/>
-          <w:b w:val="0"/>
-          <w:i w:val="0"/>
-          <w:sz w:val="20"/>
-        </w:rPr>
-        <w:t>Led 0-1 product builds end-to-end from scoping to execution: launched the consumer app MVP in 2 months and re-architected the sign-up → payment → enrolment flow — going deep with engineering on technical solutioning and scalable functional flows.</w:t>
-      </w:r>
-    </w:p>
-    <w:p>
-      <w:pPr>
-        <w:pStyle w:val="ListBullet"/>
-        <w:spacing w:after="70" w:before="0" w:line="283" w:lineRule="auto"/>
-      </w:pPr>
-      <w:r>
-        <w:rPr>
-          <w:rFonts w:ascii="Calibri" w:hAnsi="Calibri"/>
-          <w:b w:val="0"/>
-          <w:i w:val="0"/>
-          <w:sz w:val="20"/>
-        </w:rPr>
-        <w:t>Stitched together systems and third-party integrations: integrated 6 payment gateways via their APIs, built an omnichannel support system consolidating multiple channels, and replaced a third-party platform with an in-house one.</w:t>
-      </w:r>
-    </w:p>
-    <w:p>
-      <w:pPr>
-        <w:spacing w:before="90" w:after="0"/>
-      </w:pPr>
-      <w:r>
-        <w:rPr>
-          <w:rFonts w:ascii="Calibri" w:hAnsi="Calibri"/>
-          <w:b/>
-          <w:i/>
-          <w:color w:val="2E5AAC"/>
-          <w:sz w:val="20"/>
-        </w:rPr>
-        <w:t>Cross-Functional Execution &amp; Integration</w:t>
-      </w:r>
-    </w:p>
-    <w:p>
-      <w:pPr>
-        <w:pStyle w:val="ListBullet"/>
-        <w:spacing w:after="70" w:before="0" w:line="283" w:lineRule="auto"/>
-      </w:pPr>
-      <w:r>
-        <w:rPr>
-          <w:rFonts w:ascii="Calibri" w:hAnsi="Calibri"/>
-          <w:b w:val="0"/>
-          <w:i w:val="0"/>
-          <w:sz w:val="20"/>
-        </w:rPr>
-        <w:t>Owned high-impact, cross-functional projects with Engineering, Operations, and Product plus external partners (payment, messaging, and telephony vendors) — ensuring seamless integration and rollout of technical solutions.</w:t>
-      </w:r>
-    </w:p>
-    <w:p>
-      <w:pPr>
-        <w:pStyle w:val="ListBullet"/>
-        <w:spacing w:after="70" w:before="0" w:line="283" w:lineRule="auto"/>
-      </w:pPr>
-      <w:r>
-        <w:rPr>
-          <w:rFonts w:ascii="Calibri" w:hAnsi="Calibri"/>
-          <w:b w:val="0"/>
-          <w:i w:val="0"/>
-          <w:sz w:val="20"/>
-        </w:rPr>
-        <w:t>Translated business requirements into scalable solutions and automated backend workflows (manual punching 100%→2%), reducing manual intervention and saving ₹1.6L/month.</w:t>
-      </w:r>
-    </w:p>
-    <w:p>
-      <w:pPr>
-        <w:spacing w:before="90" w:after="0"/>
-      </w:pPr>
-      <w:r>
-        <w:rPr>
-          <w:rFonts w:ascii="Calibri" w:hAnsi="Calibri"/>
-          <w:b/>
-          <w:i/>
-          <w:color w:val="2E5AAC"/>
-          <w:sz w:val="20"/>
-        </w:rPr>
-        <w:t>Problem Solving, Data &amp; Impact</w:t>
-      </w:r>
-    </w:p>
-    <w:p>
-      <w:pPr>
-        <w:pStyle w:val="ListBullet"/>
-        <w:spacing w:after="70" w:before="0" w:line="283" w:lineRule="auto"/>
-      </w:pPr>
-      <w:r>
-        <w:rPr>
-          <w:rFonts w:ascii="Calibri" w:hAnsi="Calibri"/>
-          <w:b w:val="0"/>
-          <w:i w:val="0"/>
-          <w:sz w:val="20"/>
-        </w:rPr>
-        <w:t>Applied sharp logical and problem-solving skills with data (SQL and Power BI dashboards) to identify bottlenecks and drive decisions in a fast, unstructured environment.</w:t>
-      </w:r>
-    </w:p>
-    <w:p>
-      <w:pPr>
-        <w:pStyle w:val="ListBullet"/>
-        <w:spacing w:after="70" w:before="0" w:line="283" w:lineRule="auto"/>
-      </w:pPr>
-      <w:r>
-        <w:rPr>
-          <w:rFonts w:ascii="Calibri" w:hAnsi="Calibri"/>
-          <w:b w:val="0"/>
-          <w:i w:val="0"/>
-          <w:sz w:val="20"/>
-        </w:rPr>
-        <w:t>Drove business impact with high ownership: 20% revenue growth, 25% ARPU expansion (₹35K → ₹45K), and ₹70L in renewals in a single month.</w:t>
-      </w:r>
-    </w:p>
-    <w:p>
-      <w:pPr>
-        <w:spacing w:before="150" w:after="70"/>
-        <w:pBdr>
-          <w:bottom w:val="single" w:sz="6" w:space="1" w:color="2E5AAC"/>
-        </w:pBdr>
-      </w:pPr>
-      <w:r>
-        <w:rPr>
-          <w:rFonts w:ascii="Calibri" w:hAnsi="Calibri"/>
-          <w:b/>
-          <w:color w:val="1F3864"/>
-          <w:sz w:val="23"/>
         </w:rPr>
         <w:t>CORE COMPETENCIES</w:t>
       </w:r>
@@ -302,14 +153,14 @@
           <w:rFonts w:ascii="Calibri" w:hAnsi="Calibri"/>
           <w:b w:val="0"/>
           <w:i w:val="0"/>
-          <w:sz w:val="20"/>
+          <w:sz w:val="19"/>
         </w:rPr>
-        <w:t>0-1 Product Building · Technical Solutioning &amp; System Integration · Business Requirements → Scalable Functional Flows · Cross-Functional Execution (Engineering, Ops, Product) · Third-Party / External Partner Integration · End-to-End Project Ownership (Scoping → Execution) · Problem Solving &amp; Logical Reasoning · Data-Driven Decisions (SQL, Power BI) · Automation &amp; Process Efficiency · High Ownership &amp; Bias for Action · Stakeholder Management · Agile/Scrum</w:t>
+        <w:t>0-to-1 Product Building · Product Roadmap &amp; Planning · Product Lifecycle Management · Technical Solutioning &amp; System Integration · Business Requirements to Scalable Flows · Third-Party / External Partner Integration · End-to-End Project Ownership (Scoping to Execution) · Cross-Functional Execution (Engineering, Ops, Product) · SQL &amp; Data-Driven Decisions · Problem Solving · Workflow Automation · Prioritization (RICE) · Stakeholder Management · Product Management · High Ownership &amp; Bias for Action</w:t>
       </w:r>
     </w:p>
     <w:p>
       <w:pPr>
-        <w:spacing w:before="150" w:after="70"/>
+        <w:spacing w:before="150" w:after="60"/>
         <w:pBdr>
           <w:bottom w:val="single" w:sz="6" w:space="1" w:color="2E5AAC"/>
         </w:pBdr>
@@ -319,110 +170,250 @@
           <w:rFonts w:ascii="Calibri" w:hAnsi="Calibri"/>
           <w:b/>
           <w:color w:val="1F3864"/>
-          <w:sz w:val="23"/>
+          <w:sz w:val="22"/>
         </w:rPr>
-        <w:t>TECHNICAL SKILLS &amp; TOOLS</w:t>
+        <w:t>PROFESSIONAL EXPERIENCE</w:t>
       </w:r>
     </w:p>
     <w:p>
       <w:pPr>
-        <w:pStyle w:val="ListBullet"/>
-        <w:spacing w:after="70" w:before="0" w:line="283" w:lineRule="auto"/>
+        <w:spacing w:after="0"/>
       </w:pPr>
       <w:r>
         <w:rPr>
           <w:rFonts w:ascii="Calibri" w:hAnsi="Calibri"/>
           <w:b/>
           <w:i w:val="0"/>
-          <w:sz w:val="20"/>
+          <w:sz w:val="21"/>
         </w:rPr>
-        <w:t xml:space="preserve">Data &amp; Analytics: </w:t>
+        <w:t>PlanetSpark — Gurugram</w:t>
+      </w:r>
+    </w:p>
+    <w:p>
+      <w:pPr>
+        <w:spacing w:after="70"/>
+      </w:pPr>
+      <w:r>
+        <w:rPr>
+          <w:rFonts w:ascii="Calibri" w:hAnsi="Calibri"/>
+          <w:b w:val="0"/>
+          <w:i/>
+          <w:color w:val="333333"/>
+          <w:sz w:val="19"/>
+        </w:rPr>
+        <w:t>A B2C subscription marketplace (EdTech) connecting 150,000+ enrolled users with teachers via a shared LMS — spanning consumer app, two-sided platform, payments, CRM, renewals, and lifecycle products, with 30,000+ daily active users. Progressed across three roles while owning an expanding product surface.</w:t>
+      </w:r>
+    </w:p>
+    <w:p>
+      <w:pPr>
+        <w:tabs>
+          <w:tab w:pos="10546" w:val="right"/>
+        </w:tabs>
+        <w:spacing w:before="80" w:after="0"/>
+      </w:pPr>
+      <w:r>
+        <w:rPr>
+          <w:rFonts w:ascii="Calibri" w:hAnsi="Calibri"/>
+          <w:b/>
+          <w:i/>
+          <w:color w:val="2E5AAC"/>
+          <w:sz w:val="19"/>
+        </w:rPr>
+        <w:t>Product Manager</w:t>
       </w:r>
       <w:r>
         <w:rPr>
           <w:rFonts w:ascii="Calibri" w:hAnsi="Calibri"/>
           <w:b w:val="0"/>
-          <w:i w:val="0"/>
-          <w:sz w:val="20"/>
+          <w:i/>
+          <w:color w:val="444444"/>
+          <w:sz w:val="19"/>
         </w:rPr>
-        <w:t>SQL, Power BI, GA4, MS Excel (Advanced), Python (basic)</w:t>
+        <w:tab/>
+        <w:t>Sep 2023 – Present</w:t>
       </w:r>
     </w:p>
     <w:p>
       <w:pPr>
         <w:pStyle w:val="ListBullet"/>
-        <w:spacing w:after="70" w:before="0" w:line="283" w:lineRule="auto"/>
+        <w:spacing w:after="70" w:before="0" w:line="293" w:lineRule="auto"/>
+      </w:pPr>
+      <w:r>
+        <w:rPr>
+          <w:rFonts w:ascii="Calibri" w:hAnsi="Calibri"/>
+          <w:b w:val="0"/>
+          <w:i w:val="0"/>
+          <w:sz w:val="19"/>
+        </w:rPr>
+        <w:t>Led 0-to-1 product builds end-to-end, from scoping to execution — launched the consumer app MVP in 2 months and re-architected the sign-up to payment to enrolment flow (single-step OTP, a ranking model, and 6 API-integrated payment gateways) — going deep with engineering on technical solutioning and scalable functional flows.</w:t>
+      </w:r>
+    </w:p>
+    <w:p>
+      <w:pPr>
+        <w:pStyle w:val="ListBullet"/>
+        <w:spacing w:after="70" w:before="0" w:line="293" w:lineRule="auto"/>
+      </w:pPr>
+      <w:r>
+        <w:rPr>
+          <w:rFonts w:ascii="Calibri" w:hAnsi="Calibri"/>
+          <w:b w:val="0"/>
+          <w:i w:val="0"/>
+          <w:sz w:val="19"/>
+        </w:rPr>
+        <w:t>Own the full product suite for a platform with 150,000+ users and 30,000+ daily actives, leading cross-functional projects across engineering, operations, and product from discovery to launch.</w:t>
+      </w:r>
+    </w:p>
+    <w:p>
+      <w:pPr>
+        <w:pStyle w:val="ListBullet"/>
+        <w:spacing w:after="70" w:before="0" w:line="293" w:lineRule="auto"/>
+      </w:pPr>
+      <w:r>
+        <w:rPr>
+          <w:rFonts w:ascii="Calibri" w:hAnsi="Calibri"/>
+          <w:b w:val="0"/>
+          <w:i w:val="0"/>
+          <w:sz w:val="19"/>
+        </w:rPr>
+        <w:t>Stitched together systems and external-partner integrations — payment, messaging, telephony, and video vendors via their APIs — and consolidated multi-channel support into one system with a RAG-based assistant, cutting first-response time from 4 minutes to under 10 seconds.</w:t>
+      </w:r>
+    </w:p>
+    <w:p>
+      <w:pPr>
+        <w:pStyle w:val="ListBullet"/>
+        <w:spacing w:after="70" w:before="0" w:line="293" w:lineRule="auto"/>
+      </w:pPr>
+      <w:r>
+        <w:rPr>
+          <w:rFonts w:ascii="Calibri" w:hAnsi="Calibri"/>
+          <w:b w:val="0"/>
+          <w:i w:val="0"/>
+          <w:sz w:val="19"/>
+        </w:rPr>
+        <w:t>Built an advisor-level P&amp;L and performance tracker, using SQL and Power BI to turn operating data into decisions that grew profitable advisors from ~50 to 125 over three months.</w:t>
+      </w:r>
+    </w:p>
+    <w:p>
+      <w:pPr>
+        <w:tabs>
+          <w:tab w:pos="10546" w:val="right"/>
+        </w:tabs>
+        <w:spacing w:before="80" w:after="0"/>
       </w:pPr>
       <w:r>
         <w:rPr>
           <w:rFonts w:ascii="Calibri" w:hAnsi="Calibri"/>
           <w:b/>
-          <w:i w:val="0"/>
-          <w:sz w:val="20"/>
+          <w:i/>
+          <w:color w:val="2E5AAC"/>
+          <w:sz w:val="19"/>
         </w:rPr>
-        <w:t xml:space="preserve">Tech &amp; Integration: </w:t>
+        <w:t>Assistant Product Manager</w:t>
       </w:r>
       <w:r>
         <w:rPr>
           <w:rFonts w:ascii="Calibri" w:hAnsi="Calibri"/>
           <w:b w:val="0"/>
-          <w:i w:val="0"/>
-          <w:sz w:val="20"/>
+          <w:i/>
+          <w:color w:val="444444"/>
+          <w:sz w:val="19"/>
         </w:rPr>
-        <w:t>REST APIs, third-party API integration, backend systems, workflow automation</w:t>
+        <w:tab/>
+        <w:t>Sep 2022 – Aug 2023</w:t>
       </w:r>
     </w:p>
     <w:p>
       <w:pPr>
         <w:pStyle w:val="ListBullet"/>
-        <w:spacing w:after="70" w:before="0" w:line="283" w:lineRule="auto"/>
+        <w:spacing w:after="70" w:before="0" w:line="293" w:lineRule="auto"/>
+      </w:pPr>
+      <w:r>
+        <w:rPr>
+          <w:rFonts w:ascii="Calibri" w:hAnsi="Calibri"/>
+          <w:b w:val="0"/>
+          <w:i w:val="0"/>
+          <w:sz w:val="19"/>
+        </w:rPr>
+        <w:t>Translated business requirements into scalable functional flows: automated enrolment, verification, and backend-punching workflows (manual punching 100% to ~2%), cutting operations workload 80% and saving Rs 1.6L/month.</w:t>
+      </w:r>
+    </w:p>
+    <w:p>
+      <w:pPr>
+        <w:pStyle w:val="ListBullet"/>
+        <w:spacing w:after="70" w:before="0" w:line="293" w:lineRule="auto"/>
+      </w:pPr>
+      <w:r>
+        <w:rPr>
+          <w:rFonts w:ascii="Calibri" w:hAnsi="Calibri"/>
+          <w:b w:val="0"/>
+          <w:i w:val="0"/>
+          <w:sz w:val="19"/>
+        </w:rPr>
+        <w:t>Built the LPP (Learn, Practice, Perform) module 0-to-1 — driving 20% revenue growth and 25% ARPU expansion (Rs 35K to Rs 45K).</w:t>
+      </w:r>
+    </w:p>
+    <w:p>
+      <w:pPr>
+        <w:tabs>
+          <w:tab w:pos="10546" w:val="right"/>
+        </w:tabs>
+        <w:spacing w:before="80" w:after="0"/>
       </w:pPr>
       <w:r>
         <w:rPr>
           <w:rFonts w:ascii="Calibri" w:hAnsi="Calibri"/>
           <w:b/>
-          <w:i w:val="0"/>
-          <w:sz w:val="20"/>
+          <w:i/>
+          <w:color w:val="2E5AAC"/>
+          <w:sz w:val="19"/>
         </w:rPr>
-        <w:t xml:space="preserve">Product &amp; Delivery: </w:t>
+        <w:t>Senior Product Analyst</w:t>
       </w:r>
       <w:r>
         <w:rPr>
           <w:rFonts w:ascii="Calibri" w:hAnsi="Calibri"/>
           <w:b w:val="0"/>
-          <w:i w:val="0"/>
-          <w:sz w:val="20"/>
+          <w:i/>
+          <w:color w:val="444444"/>
+          <w:sz w:val="19"/>
         </w:rPr>
-        <w:t>JIRA, Confluence, Agile/Scrum, product requirements, RICE prioritization</w:t>
+        <w:tab/>
+        <w:t>Mar 2021 – Aug 2022</w:t>
       </w:r>
     </w:p>
     <w:p>
       <w:pPr>
         <w:pStyle w:val="ListBullet"/>
-        <w:spacing w:after="70" w:before="0" w:line="283" w:lineRule="auto"/>
+        <w:spacing w:after="70" w:before="0" w:line="293" w:lineRule="auto"/>
       </w:pPr>
-      <w:r>
-        <w:rPr>
-          <w:rFonts w:ascii="Calibri" w:hAnsi="Calibri"/>
-          <w:b/>
-          <w:i w:val="0"/>
-          <w:sz w:val="20"/>
-        </w:rPr>
-        <w:t xml:space="preserve">AI &amp; Tools: </w:t>
-      </w:r>
       <w:r>
         <w:rPr>
           <w:rFonts w:ascii="Calibri" w:hAnsi="Calibri"/>
           <w:b w:val="0"/>
           <w:i w:val="0"/>
-          <w:sz w:val="20"/>
+          <w:sz w:val="19"/>
         </w:rPr>
-        <w:t>OpenAI / Gemini / Claude APIs, prompt engineering</w:t>
+        <w:t>Wrote SQL queries and built Power BI dashboards (from Metabase data) across growth, revenue, and operations for data analysis, troubleshooting, and product decisions.</w:t>
       </w:r>
     </w:p>
     <w:p>
       <w:pPr>
-        <w:spacing w:before="150" w:after="70"/>
+        <w:pStyle w:val="ListBullet"/>
+        <w:spacing w:after="70" w:before="0" w:line="293" w:lineRule="auto"/>
+      </w:pPr>
+      <w:r>
+        <w:rPr>
+          <w:rFonts w:ascii="Calibri" w:hAnsi="Calibri"/>
+          <w:b w:val="0"/>
+          <w:i w:val="0"/>
+          <w:sz w:val="19"/>
+        </w:rPr>
+        <w:t>Implemented customer and transaction-verification controls that reduced invalid or fraudulent transactions from ~10% to 1% with minimal manual intervention.</w:t>
+      </w:r>
+    </w:p>
+    <w:p>
+      <w:pPr>
+        <w:spacing w:before="150" w:after="60"/>
         <w:pBdr>
           <w:bottom w:val="single" w:sz="6" w:space="1" w:color="2E5AAC"/>
         </w:pBdr>
@@ -432,9 +423,122 @@
           <w:rFonts w:ascii="Calibri" w:hAnsi="Calibri"/>
           <w:b/>
           <w:color w:val="1F3864"/>
-          <w:sz w:val="23"/>
+          <w:sz w:val="22"/>
         </w:rPr>
-        <w:t>EDUCATION</w:t>
+        <w:t>TECHNICAL SKILLS &amp; TOOLS</w:t>
+      </w:r>
+    </w:p>
+    <w:p>
+      <w:pPr>
+        <w:pStyle w:val="ListBullet"/>
+        <w:spacing w:after="70" w:before="0" w:line="293" w:lineRule="auto"/>
+      </w:pPr>
+      <w:r>
+        <w:rPr>
+          <w:rFonts w:ascii="Calibri" w:hAnsi="Calibri"/>
+          <w:b/>
+          <w:i w:val="0"/>
+          <w:sz w:val="19"/>
+        </w:rPr>
+        <w:t xml:space="preserve">Data &amp; Analytics: </w:t>
+      </w:r>
+      <w:r>
+        <w:rPr>
+          <w:rFonts w:ascii="Calibri" w:hAnsi="Calibri"/>
+          <w:b w:val="0"/>
+          <w:i w:val="0"/>
+          <w:sz w:val="19"/>
+        </w:rPr>
+        <w:t>SQL, Metabase, Power BI, GA4, MS Excel (Advanced)</w:t>
+      </w:r>
+    </w:p>
+    <w:p>
+      <w:pPr>
+        <w:pStyle w:val="ListBullet"/>
+        <w:spacing w:after="70" w:before="0" w:line="293" w:lineRule="auto"/>
+      </w:pPr>
+      <w:r>
+        <w:rPr>
+          <w:rFonts w:ascii="Calibri" w:hAnsi="Calibri"/>
+          <w:b/>
+          <w:i w:val="0"/>
+          <w:sz w:val="19"/>
+        </w:rPr>
+        <w:t xml:space="preserve">Tech &amp; Integration: </w:t>
+      </w:r>
+      <w:r>
+        <w:rPr>
+          <w:rFonts w:ascii="Calibri" w:hAnsi="Calibri"/>
+          <w:b w:val="0"/>
+          <w:i w:val="0"/>
+          <w:sz w:val="19"/>
+        </w:rPr>
+        <w:t>REST APIs, third-party API &amp; payment-gateway integration, backend systems, workflow automation</w:t>
+      </w:r>
+    </w:p>
+    <w:p>
+      <w:pPr>
+        <w:pStyle w:val="ListBullet"/>
+        <w:spacing w:after="70" w:before="0" w:line="293" w:lineRule="auto"/>
+      </w:pPr>
+      <w:r>
+        <w:rPr>
+          <w:rFonts w:ascii="Calibri" w:hAnsi="Calibri"/>
+          <w:b/>
+          <w:i w:val="0"/>
+          <w:sz w:val="19"/>
+        </w:rPr>
+        <w:t xml:space="preserve">Product &amp; Delivery: </w:t>
+      </w:r>
+      <w:r>
+        <w:rPr>
+          <w:rFonts w:ascii="Calibri" w:hAnsi="Calibri"/>
+          <w:b w:val="0"/>
+          <w:i w:val="0"/>
+          <w:sz w:val="19"/>
+        </w:rPr>
+        <w:t>JIRA, Confluence, Agile/Scrum, RICE prioritization, PRDs, roadmap</w:t>
+      </w:r>
+    </w:p>
+    <w:p>
+      <w:pPr>
+        <w:pStyle w:val="ListBullet"/>
+        <w:spacing w:after="70" w:before="0" w:line="293" w:lineRule="auto"/>
+      </w:pPr>
+      <w:r>
+        <w:rPr>
+          <w:rFonts w:ascii="Calibri" w:hAnsi="Calibri"/>
+          <w:b/>
+          <w:i w:val="0"/>
+          <w:sz w:val="19"/>
+        </w:rPr>
+        <w:t xml:space="preserve">AI &amp; Tools: </w:t>
+      </w:r>
+      <w:r>
+        <w:rPr>
+          <w:rFonts w:ascii="Calibri" w:hAnsi="Calibri"/>
+          <w:b w:val="0"/>
+          <w:i w:val="0"/>
+          <w:sz w:val="19"/>
+        </w:rPr>
+        <w:t>Claude Code, LLM APIs, Prompt Engineering, RAG, Figma</w:t>
+      </w:r>
+    </w:p>
+    <w:p>
+      <w:pPr>
+        <w:spacing w:before="150" w:after="60"/>
+        <w:pBdr>
+          <w:bottom w:val="single" w:sz="6" w:space="1" w:color="2E5AAC"/>
+        </w:pBdr>
+      </w:pPr>
+      <w:r>
+        <w:rPr>
+          <w:rFonts w:ascii="Calibri" w:hAnsi="Calibri"/>
+          <w:b/>
+          <w:color w:val="1F3864"/>
+          <w:sz w:val="22"/>
+        </w:rPr>
+        <w:t>EDUCATION &amp; CERTIFICATIONS</w:t>
       </w:r>
     </w:p>
     <w:p>
@@ -449,7 +553,7 @@
           <w:rFonts w:ascii="Calibri" w:hAnsi="Calibri"/>
           <w:b/>
           <w:i w:val="0"/>
-          <w:sz w:val="20"/>
+          <w:sz w:val="19"/>
         </w:rPr>
         <w:t>BBA — Chandigarh University, Chandigarh</w:t>
       </w:r>
@@ -459,70 +563,25 @@
           <w:b w:val="0"/>
           <w:i w:val="0"/>
           <w:color w:val="444444"/>
-          <w:sz w:val="20"/>
+          <w:sz w:val="19"/>
         </w:rPr>
         <w:tab/>
-        <w:t>2019 – 2021</w:t>
+        <w:t>2018 – 2021</w:t>
       </w:r>
     </w:p>
     <w:p>
       <w:pPr>
-        <w:tabs>
-          <w:tab w:pos="10546" w:val="right"/>
-        </w:tabs>
         <w:spacing w:after="70"/>
       </w:pPr>
-      <w:r>
-        <w:rPr>
-          <w:rFonts w:ascii="Calibri" w:hAnsi="Calibri"/>
-          <w:b/>
-          <w:i w:val="0"/>
-          <w:sz w:val="20"/>
-        </w:rPr>
-        <w:t>Class XII (ISC), St. Thomas High School, Kanpur</w:t>
-      </w:r>
       <w:r>
         <w:rPr>
           <w:rFonts w:ascii="Calibri" w:hAnsi="Calibri"/>
           <w:b w:val="0"/>
           <w:i w:val="0"/>
           <w:color w:val="444444"/>
-          <w:sz w:val="20"/>
+          <w:sz w:val="19"/>
         </w:rPr>
-        <w:tab/>
-        <w:t>2018</w:t>
-      </w:r>
-    </w:p>
-    <w:p>
-      <w:pPr>
-        <w:spacing w:before="150" w:after="70"/>
-        <w:pBdr>
-          <w:bottom w:val="single" w:sz="6" w:space="1" w:color="2E5AAC"/>
-        </w:pBdr>
-      </w:pPr>
-      <w:r>
-        <w:rPr>
-          <w:rFonts w:ascii="Calibri" w:hAnsi="Calibri"/>
-          <w:b/>
-          <w:color w:val="1F3864"/>
-          <w:sz w:val="23"/>
-        </w:rPr>
-        <w:t>CERTIFICATIONS</w:t>
-      </w:r>
-    </w:p>
-    <w:p>
-      <w:pPr>
-        <w:pStyle w:val="ListBullet"/>
-        <w:spacing w:after="70" w:before="0" w:line="283" w:lineRule="auto"/>
-      </w:pPr>
-      <w:r>
-        <w:rPr>
-          <w:rFonts w:ascii="Calibri" w:hAnsi="Calibri"/>
-          <w:b w:val="0"/>
-          <w:i w:val="0"/>
-          <w:sz w:val="20"/>
-        </w:rPr>
-        <w:t>Product Management Certification — Udemy (2024)    •    JIRA Certification — Udemy (2024)</w:t>
+        <w:t>Product Management Certification — Udemy (2024)    •    Portfolio: kshitizyadav788-svg.github.io/career-dashboard/portfolio.html</w:t>
       </w:r>
     </w:p>
     <w:sectPr>
@@ -899,11 +958,11 @@
     <w:qFormat/>
     <w:rsid w:val="00FC693F"/>
     <w:pPr>
-      <w:spacing w:after="70" w:before="0" w:line="283" w:lineRule="auto"/>
+      <w:spacing w:after="70" w:before="0" w:line="293" w:lineRule="auto"/>
     </w:pPr>
     <w:rPr>
       <w:rFonts w:ascii="Calibri" w:hAnsi="Calibri"/>
-      <w:sz w:val="20"/>
+      <w:sz w:val="19"/>
     </w:rPr>
   </w:style>
   <w:style w:type="paragraph" w:styleId="Header">
@@ -1432,12 +1491,12 @@
       <w:numPr>
         <w:numId w:val="1"/>
       </w:numPr>
-      <w:spacing w:after="70" w:before="0" w:line="283" w:lineRule="auto"/>
+      <w:spacing w:after="70" w:before="0" w:line="293" w:lineRule="auto"/>
       <w:contextualSpacing/>
     </w:pPr>
     <w:rPr>
       <w:rFonts w:ascii="Calibri" w:hAnsi="Calibri"/>
-      <w:sz w:val="20"/>
+      <w:sz w:val="19"/>
     </w:rPr>
   </w:style>
   <w:style w:type="paragraph" w:styleId="ListBullet2">

</xml_diff>